<commit_message>
court(vt): answering brief regenerated on the shared model, latex gated, docx reported (fb-595.54.73)
The doubled closing quote of the INPUT (p15 "roads.’’") is the quotation's closing mark "”".

Co-Authored-By: Claude Opus 5.5 <noreply@anthropic.com>
</commit_message>
<xml_diff>
--- a/courts/second-circuit/vermont/state/supreme-court/answering-brief/usage/OUTPUT-answering-brief.docx
+++ b/courts/second-circuit/vermont/state/supreme-court/answering-brief/usage/OUTPUT-answering-brief.docx
@@ -3271,7 +3271,7 @@
         <w:t xml:space="preserve">State v. Lockwood</w:t>
       </w:r>
       <w:r>
-        <w:t xml:space="preserve">, 160 Vt. 547, 559 (1993). In determining whether the administration of a preliminary breath test is reasonable under Article 11 this Court has recognized the need to balance the intrusion into a suspect’s privacy with “the important public-safety need to identify and remove drunk drivers from the roads.’’</w:t>
+        <w:t xml:space="preserve">, 160 Vt. 547, 559 (1993). In determining whether the administration of a preliminary breath test is reasonable under Article 11 this Court has recognized the need to balance the intrusion into a suspect’s privacy with “the important public-safety need to identify and remove drunk drivers from the roads.”</w:t>
       </w:r>
       <w:r>
         <w:t xml:space="preserve"> </w:t>
@@ -7122,7 +7122,7 @@
         <w:t xml:space="preserve"> </w:t>
       </w:r>
       <w:r>
-        <w:t xml:space="preserve">https://​​www.​cbp.​gov/​​sites/​​default/​​files/​​assets/​​documents/​​2020-​Jan/​​U.​S.%20Border%20Patrol%20Fiscal%20Year%202019%20Sector%20Profile_0.​pdf</w:t>
+        <w:t xml:space="preserve">https://​www.​cbp.​gov/​sites/​default/​files/​assets/​documents/​2020-​Jan/​U.​S.%20Border%20Patrol%20Fiscal%20Year%202019%20Sector%20Profile_0.​pdf</w:t>
       </w:r>
     </w:p>
   </w:footnote>
@@ -8115,6 +8115,33 @@
     <w:pPr>
       <w:spacing w:before="0" w:after="0" w:line="276" w:lineRule="exact"/>
       <w:ind w:left="2160" w:hanging="720"/>
+    </w:pPr>
+  </w:style>
+  <w:style w:type="paragraph" w:customStyle="1" w:styleId="XdQuoteList1">
+    <w:name w:val="Xd Quote List 1"/>
+    <w:basedOn w:val="Normal"/>
+    <w:qFormat/>
+    <w:pPr>
+      <w:spacing w:before="0" w:after="0" w:line="276" w:lineRule="exact"/>
+      <w:ind w:left="1440" w:right="720" w:hanging="720"/>
+    </w:pPr>
+  </w:style>
+  <w:style w:type="paragraph" w:customStyle="1" w:styleId="XdQuoteList2">
+    <w:name w:val="Xd Quote List 2"/>
+    <w:basedOn w:val="Normal"/>
+    <w:qFormat/>
+    <w:pPr>
+      <w:spacing w:before="0" w:after="0" w:line="276" w:lineRule="exact"/>
+      <w:ind w:left="2160" w:right="720" w:hanging="720"/>
+    </w:pPr>
+  </w:style>
+  <w:style w:type="paragraph" w:customStyle="1" w:styleId="XdQuoteList3">
+    <w:name w:val="Xd Quote List 3"/>
+    <w:basedOn w:val="Normal"/>
+    <w:qFormat/>
+    <w:pPr>
+      <w:spacing w:before="0" w:after="0" w:line="276" w:lineRule="exact"/>
+      <w:ind w:left="2880" w:right="720" w:hanging="720"/>
     </w:pPr>
   </w:style>
   <w:style w:type="paragraph" w:customStyle="1" w:styleId="XdQuoteFirst">

</xml_diff>